<commit_message>
Tara: Lode laat Tara stoppen met het berkje uit te rukken
Co-Authored-By: Claude Opus 5.5 <noreply@anthropic.com>
Claude-Session: https://claude.ai/code/session_011xXeHb7kuJsamVtPUp8TTz
</commit_message>
<xml_diff>
--- a/tara-een-hondenleven/manuscript/Tara_een_Hondenleven_manuscript_v2.docx
+++ b/tara-een-hondenleven/manuscript/Tara_een_Hondenleven_manuscript_v2.docx
@@ -9950,7 +9950,7 @@
         <w:pStyle w:val="BodyText"/>
       </w:pPr>
       <w:r>
-        <w:t xml:space="preserve">De berk boog. Zijn bladeren ritselden boven mijn kop en zijn kruin zwiepte heen en weer. Ik zette mijn achterpoten schrap en trok nog eens, grommend, want een opdracht is een opdracht. Het zand rond zijn voet barstte open. Er kwam een wortel boven, wit en nat, die naar aarde van heel diep rook.</w:t>
+        <w:t xml:space="preserve">De berk boog. Zijn bladeren ritselden boven mijn kop en zijn kruin zwiepte heen en weer. Ik zette mijn achterpoten schrap en trok nog eens, grommend, want een opdracht is een opdracht. Het zand rond zijn voet begon te kraken.</w:t>
       </w:r>
     </w:p>
     <w:p>
@@ -9980,7 +9980,29 @@
         <w:pStyle w:val="BodyText"/>
       </w:pPr>
       <w:r>
-        <w:t xml:space="preserve">Ik liet niet los. Over het pad kwam een vrouw met een wandelstok. Ze keek naar mij, naar de trillende berk, en naar de man die op zijn knieën in het zand zat.</w:t>
+        <w:t xml:space="preserve">Daarna rechtte hij zijn rug, en zijn stem werd die van het terras: laag en kalm.</w:t>
+      </w:r>
+    </w:p>
+    <w:p>
+      <w:pPr>
+        <w:pStyle w:val="BodyText"/>
+      </w:pPr>
+      <w:r>
+        <w:t xml:space="preserve">“</w:t>
+      </w:r>
+      <w:r>
+        <w:t xml:space="preserve">Tara. Laat los. Laat staan.</w:t>
+      </w:r>
+      <w:r>
+        <w:t xml:space="preserve">”</w:t>
+      </w:r>
+    </w:p>
+    <w:p>
+      <w:pPr>
+        <w:pStyle w:val="BodyText"/>
+      </w:pPr>
+      <w:r>
+        <w:t xml:space="preserve">Ik liet los. De berk zwiepte terug en stond weer recht, een beetje scheef aan de voet, met bladeren die nog even natrilden. Ik ging zitten, want als zijn stem zo klonk, kwam er na het zitten iets. Over het pad kwam een vrouw met een wandelstok. Ze keek naar mij, naar de trillende berk, en naar de man die met natte ogen naast een boompje stond.</w:t>
       </w:r>
     </w:p>
     <w:p>
@@ -10000,7 +10022,7 @@
         <w:t xml:space="preserve"> </w:t>
       </w:r>
       <w:r>
-        <w:t xml:space="preserve">zei hij tegen haar, met natte ogen.</w:t>
+        <w:t xml:space="preserve">zei hij tegen haar.</w:t>
       </w:r>
     </w:p>
     <w:p>
@@ -10016,7 +10038,7 @@
         <w:pStyle w:val="BodyText"/>
       </w:pPr>
       <w:r>
-        <w:t xml:space="preserve">Hij maakte mijn tanden voorzichtig los, zette de berk recht en trapte het zand rond de wortel aan, zoals Mieke bij haar tomaten. Toen keek hij naar links en naar rechts over het pad. Die dag vond hij zelf een stok. Hij gaf hem aan mij.</w:t>
+        <w:t xml:space="preserve">Hij trapte het zand rond de voet van de berk aan, zoals Mieke bij haar tomaten. Toen keek hij naar links en naar rechts over het pad. Die dag vond hij zelf een stok. Hij gaf hem aan mij.</w:t>
       </w:r>
     </w:p>
     <w:p>
@@ -24114,7 +24136,7 @@
         <w:t xml:space="preserve"> </w:t>
       </w:r>
       <w:r>
-        <w:t xml:space="preserve">zei, zocht ze zelf, en één keer trok ze een jonge berk half uit de grond. De tak in het ijs zat vast. Ik heb hem laten zitten.</w:t>
+        <w:t xml:space="preserve">zei, zocht ze zelf, en één keer begon ze een jonge berk uit de grond te trekken, tot ik zei dat ze moest loslaten. Ze liet los. De tak in het ijs zat vast. Ik heb hem laten zitten.</w:t>
       </w:r>
     </w:p>
     <w:p>

</xml_diff>